<commit_message>
Organizando caixa, conas a pagar
</commit_message>
<xml_diff>
--- a/Documentação/Comando SQL.docx
+++ b/Documentação/Comando SQL.docx
@@ -270,8 +270,89 @@
     </w:p>
     <w:p/>
     <w:p>
+      <w:proofErr w:type="spellStart"/>
+      <w:r>
+        <w:t>Vericar</w:t>
+      </w:r>
+      <w:proofErr w:type="spellEnd"/>
+      <w:r>
+        <w:t xml:space="preserve"> tabela:</w:t>
+      </w:r>
+      <w:r>
+        <w:br/>
+      </w:r>
+      <w:r>
+        <w:br/>
+      </w:r>
+    </w:p>
+    <w:p>
+      <w:r>
+        <w:br w:type="page"/>
+      </w:r>
+    </w:p>
+    <w:p>
       <w:bookmarkStart w:id="0" w:name="_GoBack"/>
       <w:bookmarkEnd w:id="0"/>
+    </w:p>
+    <w:p>
+      <w:r>
+        <w:br w:type="page"/>
+      </w:r>
+    </w:p>
+    <w:p>
+      <w:r>
+        <w:lastRenderedPageBreak/>
+        <w:t xml:space="preserve">SELECT </w:t>
+      </w:r>
+      <w:proofErr w:type="spellStart"/>
+      <w:r>
+        <w:t>column_name</w:t>
+      </w:r>
+      <w:proofErr w:type="spellEnd"/>
+    </w:p>
+    <w:p>
+      <w:r>
+        <w:t xml:space="preserve">FROM </w:t>
+      </w:r>
+      <w:proofErr w:type="spellStart"/>
+      <w:r>
+        <w:t>information_schema.columns</w:t>
+      </w:r>
+      <w:proofErr w:type="spellEnd"/>
+    </w:p>
+    <w:p>
+      <w:r>
+        <w:t xml:space="preserve">WHERE </w:t>
+      </w:r>
+      <w:proofErr w:type="spellStart"/>
+      <w:r>
+        <w:t>table_name</w:t>
+      </w:r>
+      <w:proofErr w:type="spellEnd"/>
+      <w:r>
+        <w:t xml:space="preserve"> = '</w:t>
+      </w:r>
+      <w:proofErr w:type="spellStart"/>
+      <w:r>
+        <w:t>contas_receber</w:t>
+      </w:r>
+      <w:proofErr w:type="spellEnd"/>
+      <w:r>
+        <w:t>'</w:t>
+      </w:r>
+    </w:p>
+    <w:p>
+      <w:r>
+        <w:t xml:space="preserve">ORDER BY </w:t>
+      </w:r>
+      <w:proofErr w:type="spellStart"/>
+      <w:r>
+        <w:t>ordinal_position</w:t>
+      </w:r>
+      <w:proofErr w:type="spellEnd"/>
+      <w:r>
+        <w:t>;</w:t>
+      </w:r>
     </w:p>
     <w:sectPr>
       <w:pgSz w:w="11906" w:h="16838"/>

</xml_diff>